<commit_message>
Update report to reflect trailer removal and clean cinema UI
</commit_message>
<xml_diff>
--- a/Online_Movie_Ticket_Booking_System_Project_Report_CS.docx
+++ b/Online_Movie_Ticket_Booking_System_Project_Report_CS.docx
@@ -7344,7 +7344,7 @@
           <w:color w:val="334155"/>
           <w:sz w:val="21"/>
         </w:rPr>
-        <w:t>Presentation Layer (React 18 SPA): Manages reactive state, date filters, trailer modals, auditorium seating grid, checkout dialogs, and printable tickets.</w:t>
+        <w:t>Presentation Layer (React 18 SPA): Manages reactive state, date filters, auditorium seating grid, checkout dialogs, and printable tickets.</w:t>
       </w:r>
     </w:p>
     <w:p>
@@ -8385,7 +8385,7 @@
           <w:color w:val="334155"/>
           <w:sz w:val="22"/>
         </w:rPr>
-        <w:t>Stores title, certification, duration, genre, trailer link, and language tags (`isTamil`, `isTamilDubbed`).</w:t>
+        <w:t>Stores title, certification, duration, genre, cast details, poster image, and language tags (isTamil, isTamilDubbed).</w:t>
       </w:r>
     </w:p>
     <w:p>
@@ -9931,7 +9931,7 @@
           <w:color w:val="334155"/>
           <w:sz w:val="22"/>
         </w:rPr>
-        <w:t>The frontend homepage (`frontend/src/App.jsx`) implements a clean TicketNew/BookMyShow schedule interface. Users select dates from a 7-day horizontal bar (`THU 01 OCT`, `FRI 02 OCT`...). Movies are displayed in individual rows with title, certification, duration, genre, trailer popup button, and showtime boxes. Hovering over any showtime displays a price tooltip (`₹190.00 PREMIUM` | `₹150.00 GOLD`).</w:t>
+        <w:t>The frontend homepage (`frontend/src/App.jsx`) implements a clean TicketNew/BookMyShow schedule interface. Users select dates from a 7-day horizontal bar (`THU 01 OCT`, `FRI 02 OCT`...). Movies are displayed in individual rows with title, certification, duration, genre, and interactive showtime boxes. Hovering over any showtime displays a price tooltip (`₹190.00 PREMIUM` | `₹150.00 GOLD`).</w:t>
       </w:r>
     </w:p>
     <w:p>

</xml_diff>